<commit_message>
docs: personalize documentation docx with name and roll number, clean up file paths, and remove demo/viva scripts
</commit_message>
<xml_diff>
--- a/project_documentation.docx
+++ b/project_documentation.docx
@@ -26,6 +26,48 @@
           <w:i/>
         </w:rPr>
         <w:t>An Enterprise-Grade Smart Water Infrastructure Monitoring, Analytics, and Management Platform.</w:t>
+      </w:r>
+    </w:p>
+    <w:p>
+      <w:pPr>
+        <w:spacing w:before="0" w:after="120" w:line="276" w:lineRule="auto"/>
+      </w:pPr>
+      <w:r>
+        <w:rPr>
+          <w:b/>
+        </w:rPr>
+        <w:t>Submitted By</w:t>
+      </w:r>
+      <w:r>
+        <w:t>: Ashutosh Rai</w:t>
+      </w:r>
+    </w:p>
+    <w:p>
+      <w:pPr>
+        <w:spacing w:before="0" w:after="120" w:line="276" w:lineRule="auto"/>
+      </w:pPr>
+      <w:r>
+        <w:rPr>
+          <w:b/>
+        </w:rPr>
+        <w:t>Roll Number</w:t>
+      </w:r>
+      <w:r>
+        <w:t>: 150096724077</w:t>
+      </w:r>
+    </w:p>
+    <w:p>
+      <w:pPr>
+        <w:spacing w:before="0" w:after="120" w:line="276" w:lineRule="auto"/>
+      </w:pPr>
+      <w:r>
+        <w:rPr>
+          <w:b/>
+        </w:rPr>
+        <w:t>Department</w:t>
+      </w:r>
+      <w:r>
+        <w:t>: Computer Science &amp; Engineering</w:t>
       </w:r>
     </w:p>
     <w:p>
@@ -4805,7 +4847,7 @@
         <w:rPr>
           <w:b/>
         </w:rPr>
-        <w:t>[frontend/Dockerfile](file:///Users/ashutoshrai/Desktop/Project-AquaGuard-CaseStudy68/frontend/Dockerfile)</w:t>
+        <w:t>`frontend/Dockerfile`</w:t>
       </w:r>
       <w:r>
         <w:t>: Uses a Node environment to compile Vite static assets, which are then served by a high-performance Nginx server container.</w:t>
@@ -4820,7 +4862,7 @@
         <w:rPr>
           <w:b/>
         </w:rPr>
-        <w:t>[backend/Dockerfile](file:///Users/ashutoshrai/Desktop/Project-AquaGuard-CaseStudy68/backend/Dockerfile)</w:t>
+        <w:t>`backend/Dockerfile`</w:t>
       </w:r>
       <w:r>
         <w:t>: Packages the Express API, leveraging micro-Node images to minimize container footprints.</w:t>
@@ -4847,7 +4889,7 @@
         <w:rPr>
           <w:b/>
         </w:rPr>
-        <w:t>[docker-compose.yml](file:///Users/ashutoshrai/Desktop/Project-AquaGuard-CaseStudy68/docker-compose.yml)</w:t>
+        <w:t>`docker-compose.yml`</w:t>
       </w:r>
       <w:r>
         <w:t xml:space="preserve"> orchestrates the local stack, managing:</w:t>
@@ -5030,7 +5072,7 @@
         <w:rPr>
           <w:b/>
         </w:rPr>
-        <w:t>[Jenkinsfile](file:///Users/ashutoshrai/Desktop/Project-AquaGuard-CaseStudy68/devops/jenkins/Jenkinsfile)</w:t>
+        <w:t>`Jenkinsfile`</w:t>
       </w:r>
       <w:r>
         <w:t>, featuring:</w:t>
@@ -5140,7 +5182,7 @@
         <w:rPr>
           <w:b/>
         </w:rPr>
-        <w:t>[devops/terraform/](file:///Users/ashutoshrai/Desktop/Project-AquaGuard-CaseStudy68/devops/terraform/)</w:t>
+        <w:t>`devops/terraform/`</w:t>
       </w:r>
       <w:r>
         <w:t>:</w:t>
@@ -5290,7 +5332,7 @@
         <w:rPr>
           <w:b/>
         </w:rPr>
-        <w:t>[devops/kubernetes/](file:///Users/ashutoshrai/Desktop/Project-AquaGuard-CaseStudy68/devops/kubernetes/)</w:t>
+        <w:t>`devops/kubernetes/`</w:t>
       </w:r>
       <w:r>
         <w:t xml:space="preserve"> deploy services to AWS EKS:</w:t>
@@ -5443,7 +5485,7 @@
         <w:rPr>
           <w:b/>
         </w:rPr>
-        <w:t>[prometheus.yml](file:///Users/ashutoshrai/Desktop/Project-AquaGuard-CaseStudy68/devops/prometheus/prometheus.yml)</w:t>
+        <w:t>`prometheus.yml`</w:t>
       </w:r>
       <w:r>
         <w:t>:</w:t>
@@ -5499,7 +5541,7 @@
         <w:rPr>
           <w:b/>
         </w:rPr>
-        <w:t>[dashboard.json](file:///Users/ashutoshrai/Desktop/Project-AquaGuard-CaseStudy68/devops/grafana/dashboard.json)</w:t>
+        <w:t>`dashboard.json`</w:t>
       </w:r>
       <w:r>
         <w:t>:</w:t>
@@ -5544,7 +5586,7 @@
         <w:rPr>
           <w:b/>
         </w:rPr>
-        <w:t>[devops/elk/](file:///Users/ashutoshrai/Desktop/Project-AquaGuard-CaseStudy68/devops/elk/)</w:t>
+        <w:t>`devops/elk/`</w:t>
       </w:r>
       <w:r>
         <w:t>:</w:t>
@@ -5629,7 +5671,7 @@
         <w:rPr>
           <w:b/>
         </w:rPr>
-        <w:t>Backup Script ([backup_restore.sh](file:///Users/ashutoshrai/Desktop/Project-AquaGuard-CaseStudy68/devops/disaster-recovery/backup_restore.sh))</w:t>
+        <w:t>Backup Script (`backup_restore.sh`)</w:t>
       </w:r>
       <w:r>
         <w:t xml:space="preserve">: automates </w:t>
@@ -5835,665 +5877,6 @@
       </w:pPr>
       <w:r>
         <w:t>Project AquaGuard is a modern, enterprise-grade water management system. It provides comprehensive monitoring of critical utility assets while ensuring operational safety and high availability through its DevOps pipeline and containerized backend, making it an excellent blueprint for smart city utility frameworks.</w:t>
-      </w:r>
-    </w:p>
-    <w:p>
-      <w:pPr>
-        <w:spacing w:before="0" w:after="120" w:line="276" w:lineRule="auto"/>
-      </w:pPr>
-      <w:r>
-        <w:t># 5 Minute Judge Demo Script</w:t>
-      </w:r>
-    </w:p>
-    <w:p>
-      <w:pPr>
-        <w:pStyle w:val="Heading2"/>
-        <w:keepNext/>
-        <w:spacing w:before="240" w:after="80"/>
-      </w:pPr>
-      <w:r>
-        <w:t>Phase 1: Authentication &amp; RBAC (0:00 - 1:00)</w:t>
-      </w:r>
-    </w:p>
-    <w:p>
-      <w:pPr>
-        <w:pStyle w:val="ListNumber"/>
-        <w:spacing w:before="0" w:after="60" w:line="276" w:lineRule="auto"/>
-      </w:pPr>
-      <w:r>
-        <w:t xml:space="preserve">Open the login page at </w:t>
-      </w:r>
-      <w:r>
-        <w:rPr>
-          <w:rFonts w:ascii="Consolas" w:hAnsi="Consolas"/>
-          <w:color w:val="0A4D68"/>
-          <w:sz w:val="19"/>
-        </w:rPr>
-        <w:t>http://localhost:5173</w:t>
-      </w:r>
-      <w:r>
-        <w:t>.</w:t>
-      </w:r>
-    </w:p>
-    <w:p>
-      <w:pPr>
-        <w:pStyle w:val="ListNumber"/>
-        <w:spacing w:before="0" w:after="60" w:line="276" w:lineRule="auto"/>
-      </w:pPr>
-      <w:r>
-        <w:t>Explain the system's role-based access:</w:t>
-      </w:r>
-    </w:p>
-    <w:p>
-      <w:pPr>
-        <w:pStyle w:val="ListBullet"/>
-        <w:spacing w:before="0" w:after="60" w:line="276" w:lineRule="auto"/>
-      </w:pPr>
-      <w:r>
-        <w:rPr>
-          <w:i/>
-        </w:rPr>
-        <w:t>"We are logging in as an Admin user. The system uses secure JWT authentication to enforce Role-Based Access Control, restricting critical settings to authorized personnel."</w:t>
-      </w:r>
-    </w:p>
-    <w:p>
-      <w:pPr>
-        <w:pStyle w:val="ListNumber"/>
-        <w:spacing w:before="0" w:after="60" w:line="276" w:lineRule="auto"/>
-      </w:pPr>
-      <w:r>
-        <w:t xml:space="preserve">Log in using username </w:t>
-      </w:r>
-      <w:r>
-        <w:rPr>
-          <w:rFonts w:ascii="Consolas" w:hAnsi="Consolas"/>
-          <w:color w:val="0A4D68"/>
-          <w:sz w:val="19"/>
-        </w:rPr>
-        <w:t>admin</w:t>
-      </w:r>
-      <w:r>
-        <w:t xml:space="preserve"> and password </w:t>
-      </w:r>
-      <w:r>
-        <w:rPr>
-          <w:rFonts w:ascii="Consolas" w:hAnsi="Consolas"/>
-          <w:color w:val="0A4D68"/>
-          <w:sz w:val="19"/>
-        </w:rPr>
-        <w:t>admin123</w:t>
-      </w:r>
-      <w:r>
-        <w:t>.</w:t>
-      </w:r>
-    </w:p>
-    <w:p>
-      <w:pPr>
-        <w:pStyle w:val="Heading2"/>
-        <w:keepNext/>
-        <w:spacing w:before="240" w:after="80"/>
-      </w:pPr>
-      <w:r>
-        <w:t>Phase 2: Single Pane Dashboard &amp; Active Telemetry (1:00 - 2:30)</w:t>
-      </w:r>
-    </w:p>
-    <w:p>
-      <w:pPr>
-        <w:pStyle w:val="ListNumber"/>
-        <w:spacing w:before="0" w:after="60" w:line="276" w:lineRule="auto"/>
-      </w:pPr>
-      <w:r>
-        <w:t xml:space="preserve">Point out the </w:t>
-      </w:r>
-      <w:r>
-        <w:rPr>
-          <w:b/>
-        </w:rPr>
-        <w:t>5 KPI cards</w:t>
-      </w:r>
-      <w:r>
-        <w:t xml:space="preserve"> at the top:</w:t>
-      </w:r>
-    </w:p>
-    <w:p>
-      <w:pPr>
-        <w:pStyle w:val="ListBullet"/>
-        <w:spacing w:before="0" w:after="60" w:line="276" w:lineRule="auto"/>
-      </w:pPr>
-      <w:r>
-        <w:rPr>
-          <w:i/>
-        </w:rPr>
-        <w:t>"Our dashboard displays real-time statistics: total reservoirs, active pumps, smart meters, alerts, and overall system health (calculated by combining pump temperatures and pipeline leaks)."</w:t>
-      </w:r>
-    </w:p>
-    <w:p>
-      <w:pPr>
-        <w:pStyle w:val="ListNumber"/>
-        <w:spacing w:before="0" w:after="60" w:line="276" w:lineRule="auto"/>
-      </w:pPr>
-      <w:r>
-        <w:t xml:space="preserve">Showcase the </w:t>
-      </w:r>
-      <w:r>
-        <w:rPr>
-          <w:b/>
-        </w:rPr>
-        <w:t>3 interactive charts</w:t>
-      </w:r>
-      <w:r>
-        <w:t>:</w:t>
-      </w:r>
-    </w:p>
-    <w:p>
-      <w:pPr>
-        <w:pStyle w:val="ListBullet"/>
-        <w:spacing w:before="0" w:after="60" w:line="276" w:lineRule="auto"/>
-      </w:pPr>
-      <w:r>
-        <w:rPr>
-          <w:i/>
-        </w:rPr>
-        <w:t>"The Water Consumption line graph monitors flow rates, the Reservoir Capacity bar chart displays fill volumes, and the Alert distribution doughnut chart organizes warnings by severity."</w:t>
-      </w:r>
-    </w:p>
-    <w:p>
-      <w:pPr>
-        <w:pStyle w:val="ListNumber"/>
-        <w:spacing w:before="0" w:after="60" w:line="276" w:lineRule="auto"/>
-      </w:pPr>
-      <w:r>
-        <w:t>Explain that this data is populated by active PostgreSQL database tables.</w:t>
-      </w:r>
-    </w:p>
-    <w:p>
-      <w:pPr>
-        <w:pStyle w:val="Heading2"/>
-        <w:keepNext/>
-        <w:spacing w:before="240" w:after="80"/>
-      </w:pPr>
-      <w:r>
-        <w:t>Phase 3: Telemetry Simulators &amp; Alerts (2:30 - 3:30)</w:t>
-      </w:r>
-    </w:p>
-    <w:p>
-      <w:pPr>
-        <w:pStyle w:val="ListNumber"/>
-        <w:spacing w:before="0" w:after="60" w:line="276" w:lineRule="auto"/>
-      </w:pPr>
-      <w:r>
-        <w:t xml:space="preserve">Navigate to the </w:t>
-      </w:r>
-      <w:r>
-        <w:rPr>
-          <w:b/>
-        </w:rPr>
-        <w:t>Pipelines</w:t>
-      </w:r>
-      <w:r>
-        <w:t xml:space="preserve"> tab.</w:t>
-      </w:r>
-    </w:p>
-    <w:p>
-      <w:pPr>
-        <w:pStyle w:val="ListNumber"/>
-        <w:spacing w:before="0" w:after="60" w:line="276" w:lineRule="auto"/>
-      </w:pPr>
-      <w:r>
-        <w:t xml:space="preserve">Select a pipeline and click </w:t>
-      </w:r>
-      <w:r>
-        <w:rPr>
-          <w:b/>
-        </w:rPr>
-        <w:t>Simulate Leak</w:t>
-      </w:r>
-      <w:r>
-        <w:t>. Explain what happens:</w:t>
-      </w:r>
-    </w:p>
-    <w:p>
-      <w:pPr>
-        <w:pStyle w:val="ListBullet"/>
-        <w:spacing w:before="0" w:after="60" w:line="276" w:lineRule="auto"/>
-      </w:pPr>
-      <w:r>
-        <w:rPr>
-          <w:i/>
-        </w:rPr>
-        <w:t>"We will simulate a pipeline leak. This drops the pipeline's pressure and flow rate in the database, which automatically dispatches a Critical Alert."</w:t>
-      </w:r>
-    </w:p>
-    <w:p>
-      <w:pPr>
-        <w:pStyle w:val="ListNumber"/>
-        <w:spacing w:before="0" w:after="60" w:line="276" w:lineRule="auto"/>
-      </w:pPr>
-      <w:r>
-        <w:t xml:space="preserve">Go back to the </w:t>
-      </w:r>
-      <w:r>
-        <w:rPr>
-          <w:b/>
-        </w:rPr>
-        <w:t>Dashboard</w:t>
-      </w:r>
-      <w:r>
-        <w:t xml:space="preserve"> or </w:t>
-      </w:r>
-      <w:r>
-        <w:rPr>
-          <w:b/>
-        </w:rPr>
-        <w:t>Alerts</w:t>
-      </w:r>
-      <w:r>
-        <w:t xml:space="preserve"> tab and show the new critical alert.</w:t>
-      </w:r>
-    </w:p>
-    <w:p>
-      <w:pPr>
-        <w:pStyle w:val="Heading2"/>
-        <w:keepNext/>
-        <w:spacing w:before="240" w:after="80"/>
-      </w:pPr>
-      <w:r>
-        <w:t>Phase 4: Maintenance Dispatch &amp; Audit Logs (3:30 - 4:30)</w:t>
-      </w:r>
-    </w:p>
-    <w:p>
-      <w:pPr>
-        <w:pStyle w:val="ListNumber"/>
-        <w:spacing w:before="0" w:after="60" w:line="276" w:lineRule="auto"/>
-      </w:pPr>
-      <w:r>
-        <w:t xml:space="preserve">Navigate to the </w:t>
-      </w:r>
-      <w:r>
-        <w:rPr>
-          <w:b/>
-        </w:rPr>
-        <w:t>Maintenance</w:t>
-      </w:r>
-      <w:r>
-        <w:t xml:space="preserve"> tab.</w:t>
-      </w:r>
-    </w:p>
-    <w:p>
-      <w:pPr>
-        <w:pStyle w:val="ListNumber"/>
-        <w:spacing w:before="0" w:after="60" w:line="276" w:lineRule="auto"/>
-      </w:pPr>
-      <w:r>
-        <w:t xml:space="preserve">Show the critical pipeline alert, click the action button to log a repair request, set priority to </w:t>
-      </w:r>
-      <w:r>
-        <w:rPr>
-          <w:b/>
-        </w:rPr>
-        <w:t>Critical</w:t>
-      </w:r>
-      <w:r>
-        <w:t>, and assign an engineer.</w:t>
-      </w:r>
-    </w:p>
-    <w:p>
-      <w:pPr>
-        <w:pStyle w:val="ListNumber"/>
-        <w:spacing w:before="0" w:after="60" w:line="276" w:lineRule="auto"/>
-      </w:pPr>
-      <w:r>
-        <w:t xml:space="preserve">Show the </w:t>
-      </w:r>
-      <w:r>
-        <w:rPr>
-          <w:b/>
-        </w:rPr>
-        <w:t>Logs</w:t>
-      </w:r>
-      <w:r>
-        <w:t xml:space="preserve"> console:</w:t>
-      </w:r>
-    </w:p>
-    <w:p>
-      <w:pPr>
-        <w:pStyle w:val="ListBullet"/>
-        <w:spacing w:before="0" w:after="60" w:line="276" w:lineRule="auto"/>
-      </w:pPr>
-      <w:r>
-        <w:rPr>
-          <w:i/>
-        </w:rPr>
-        <w:t>"Every user action, telemetry change, and simulation trigger is logged in our centralized logs feed, creating a clear audit trail."</w:t>
-      </w:r>
-    </w:p>
-    <w:p>
-      <w:pPr>
-        <w:pStyle w:val="Heading2"/>
-        <w:keepNext/>
-        <w:spacing w:before="240" w:after="80"/>
-      </w:pPr>
-      <w:r>
-        <w:t>Phase 5: Observability &amp; Closing (4:30 - 5:00)</w:t>
-      </w:r>
-    </w:p>
-    <w:p>
-      <w:pPr>
-        <w:pStyle w:val="ListNumber"/>
-        <w:spacing w:before="0" w:after="60" w:line="276" w:lineRule="auto"/>
-      </w:pPr>
-      <w:r>
-        <w:t xml:space="preserve">Navigate to the </w:t>
-      </w:r>
-      <w:r>
-        <w:rPr>
-          <w:b/>
-        </w:rPr>
-        <w:t>Monitoring</w:t>
-      </w:r>
-      <w:r>
-        <w:t xml:space="preserve"> tab. Show CPU and Memory resource dials:</w:t>
-      </w:r>
-    </w:p>
-    <w:p>
-      <w:pPr>
-        <w:pStyle w:val="ListBullet"/>
-        <w:spacing w:before="0" w:after="60" w:line="276" w:lineRule="auto"/>
-      </w:pPr>
-      <w:r>
-        <w:rPr>
-          <w:i/>
-        </w:rPr>
-        <w:t>"Finally, our system health monitors CPU, Memory, and microservice status. The entire stack is containerized with Docker, deployed using Kubernetes templates, and monitored with Prometheus and Grafana."</w:t>
-      </w:r>
-    </w:p>
-    <w:p>
-      <w:pPr>
-        <w:pStyle w:val="ListNumber"/>
-        <w:spacing w:before="0" w:after="60" w:line="276" w:lineRule="auto"/>
-      </w:pPr>
-      <w:r>
-        <w:t>Summarize the benefits:</w:t>
-      </w:r>
-    </w:p>
-    <w:p>
-      <w:pPr>
-        <w:pStyle w:val="ListBullet"/>
-        <w:spacing w:before="0" w:after="60" w:line="276" w:lineRule="auto"/>
-      </w:pPr>
-      <w:r>
-        <w:rPr>
-          <w:i/>
-        </w:rPr>
-        <w:t>"AquaGuard helps utilities prevent service downtime and mitigate water loss through real-time telemetry, automated alerts, and central control."</w:t>
-      </w:r>
-    </w:p>
-    <w:p>
-      <w:pPr>
-        <w:spacing w:before="0" w:after="120" w:line="276" w:lineRule="auto"/>
-      </w:pPr>
-      <w:r>
-        <w:t># 10 Minute Technical Viva Script</w:t>
-      </w:r>
-    </w:p>
-    <w:p>
-      <w:pPr>
-        <w:pStyle w:val="Heading2"/>
-        <w:keepNext/>
-        <w:spacing w:before="240" w:after="80"/>
-      </w:pPr>
-      <w:r>
-        <w:t>1. General Architecture &amp; Flow (0:00 - 2:00)</w:t>
-      </w:r>
-    </w:p>
-    <w:p>
-      <w:pPr>
-        <w:pStyle w:val="ListBullet"/>
-        <w:spacing w:before="0" w:after="60" w:line="276" w:lineRule="auto"/>
-      </w:pPr>
-      <w:r>
-        <w:rPr>
-          <w:b/>
-        </w:rPr>
-        <w:t>Q</w:t>
-      </w:r>
-      <w:r>
-        <w:t xml:space="preserve">: </w:t>
-      </w:r>
-      <w:r>
-        <w:rPr>
-          <w:i/>
-        </w:rPr>
-        <w:t>"How do requests travel from the client to the database?"</w:t>
-      </w:r>
-    </w:p>
-    <w:p>
-      <w:pPr>
-        <w:pStyle w:val="ListBullet"/>
-        <w:spacing w:before="0" w:after="60" w:line="276" w:lineRule="auto"/>
-      </w:pPr>
-      <w:r>
-        <w:rPr>
-          <w:b/>
-        </w:rPr>
-        <w:t>A</w:t>
-      </w:r>
-      <w:r>
-        <w:t xml:space="preserve">: </w:t>
-      </w:r>
-      <w:r>
-        <w:rPr>
-          <w:i/>
-        </w:rPr>
-        <w:t>"Requests are routed through an Nginx Ingress Controller. The Vite React client serves the UI, while the Express API backend processes data. The backend connects to a PostgreSQL database pool. Telemetry processes run in the background, updating water levels, flow rates, and temperatures in the database."</w:t>
-      </w:r>
-    </w:p>
-    <w:p>
-      <w:pPr>
-        <w:pStyle w:val="Heading2"/>
-        <w:keepNext/>
-        <w:spacing w:before="240" w:after="80"/>
-      </w:pPr>
-      <w:r>
-        <w:t>2. Database Resilience &amp; Fallbacks (2:00 - 4:00)</w:t>
-      </w:r>
-    </w:p>
-    <w:p>
-      <w:pPr>
-        <w:pStyle w:val="ListBullet"/>
-        <w:spacing w:before="0" w:after="60" w:line="276" w:lineRule="auto"/>
-      </w:pPr>
-      <w:r>
-        <w:rPr>
-          <w:b/>
-        </w:rPr>
-        <w:t>Q</w:t>
-      </w:r>
-      <w:r>
-        <w:t xml:space="preserve">: </w:t>
-      </w:r>
-      <w:r>
-        <w:rPr>
-          <w:i/>
-        </w:rPr>
-        <w:t>"What happens if the PostgreSQL database goes offline?"</w:t>
-      </w:r>
-    </w:p>
-    <w:p>
-      <w:pPr>
-        <w:pStyle w:val="ListBullet"/>
-        <w:spacing w:before="0" w:after="60" w:line="276" w:lineRule="auto"/>
-      </w:pPr>
-      <w:r>
-        <w:rPr>
-          <w:b/>
-        </w:rPr>
-        <w:t>A</w:t>
-      </w:r>
-      <w:r>
-        <w:t xml:space="preserve">: </w:t>
-      </w:r>
-      <w:r>
-        <w:rPr>
-          <w:i/>
-        </w:rPr>
-        <w:t>"If connection pool queries fail, the backend catches the exception and falls back to an in-memory mock database configured with the default seeds. This prevents API routes from hanging, keeps the application responsive, and prompts the UI to display warning indicators."</w:t>
-      </w:r>
-    </w:p>
-    <w:p>
-      <w:pPr>
-        <w:pStyle w:val="Heading2"/>
-        <w:keepNext/>
-        <w:spacing w:before="240" w:after="80"/>
-      </w:pPr>
-      <w:r>
-        <w:t>3. Frontend Error Handling (4:00 - 6:00)</w:t>
-      </w:r>
-    </w:p>
-    <w:p>
-      <w:pPr>
-        <w:pStyle w:val="ListBullet"/>
-        <w:spacing w:before="0" w:after="60" w:line="276" w:lineRule="auto"/>
-      </w:pPr>
-      <w:r>
-        <w:rPr>
-          <w:b/>
-        </w:rPr>
-        <w:t>Q</w:t>
-      </w:r>
-      <w:r>
-        <w:t xml:space="preserve">: </w:t>
-      </w:r>
-      <w:r>
-        <w:rPr>
-          <w:i/>
-        </w:rPr>
-        <w:t>"How do you prevent UI crashes when API responses return empty or malformed data?"</w:t>
-      </w:r>
-    </w:p>
-    <w:p>
-      <w:pPr>
-        <w:pStyle w:val="ListBullet"/>
-        <w:spacing w:before="0" w:after="60" w:line="276" w:lineRule="auto"/>
-      </w:pPr>
-      <w:r>
-        <w:rPr>
-          <w:b/>
-        </w:rPr>
-        <w:t>A</w:t>
-      </w:r>
-      <w:r>
-        <w:t xml:space="preserve">: </w:t>
-      </w:r>
-      <w:r>
-        <w:rPr>
-          <w:i/>
-        </w:rPr>
-        <w:t>"We implement defensive programming standards throughout our React components: optional chaining (`?.`) isolates missing properties, fallback variables (e.g. `pumps || []`) prevent map iteration failures, and `&lt;ErrorBoundary&gt;` wrappers isolate component crashes so the rest of the application remains functional."</w:t>
-      </w:r>
-    </w:p>
-    <w:p>
-      <w:pPr>
-        <w:pStyle w:val="Heading2"/>
-        <w:keepNext/>
-        <w:spacing w:before="240" w:after="80"/>
-      </w:pPr>
-      <w:r>
-        <w:t>4. DevOps, Infrastructure, and Security (6:00 - 8:00)</w:t>
-      </w:r>
-    </w:p>
-    <w:p>
-      <w:pPr>
-        <w:pStyle w:val="ListBullet"/>
-        <w:spacing w:before="0" w:after="60" w:line="276" w:lineRule="auto"/>
-      </w:pPr>
-      <w:r>
-        <w:rPr>
-          <w:b/>
-        </w:rPr>
-        <w:t>Q</w:t>
-      </w:r>
-      <w:r>
-        <w:t xml:space="preserve">: </w:t>
-      </w:r>
-      <w:r>
-        <w:rPr>
-          <w:i/>
-        </w:rPr>
-        <w:t>"How is this platform packaged, deployed, and secured?"</w:t>
-      </w:r>
-    </w:p>
-    <w:p>
-      <w:pPr>
-        <w:pStyle w:val="ListBullet"/>
-        <w:spacing w:before="0" w:after="60" w:line="276" w:lineRule="auto"/>
-      </w:pPr>
-      <w:r>
-        <w:rPr>
-          <w:b/>
-        </w:rPr>
-        <w:t>A</w:t>
-      </w:r>
-      <w:r>
-        <w:t xml:space="preserve">: </w:t>
-      </w:r>
-      <w:r>
-        <w:rPr>
-          <w:i/>
-        </w:rPr>
-        <w:t>"The stack is containerized with Docker and managed locally with Docker Compose. The infrastructure is deployed on AWS via Terraform scripts that set up a custom VPC, subnets, EC2 nodes, and RDS. EKS resources are managed using Kubernetes manifests, secret variables are encrypted, and API routes are secured with signed JWTs."</w:t>
-      </w:r>
-    </w:p>
-    <w:p>
-      <w:pPr>
-        <w:pStyle w:val="Heading2"/>
-        <w:keepNext/>
-        <w:spacing w:before="240" w:after="80"/>
-      </w:pPr>
-      <w:r>
-        <w:t>5. Monitoring &amp; Disaster Recovery (8:00 - 10:00)</w:t>
-      </w:r>
-    </w:p>
-    <w:p>
-      <w:pPr>
-        <w:pStyle w:val="ListBullet"/>
-        <w:spacing w:before="0" w:after="60" w:line="276" w:lineRule="auto"/>
-      </w:pPr>
-      <w:r>
-        <w:rPr>
-          <w:b/>
-        </w:rPr>
-        <w:t>Q</w:t>
-      </w:r>
-      <w:r>
-        <w:t xml:space="preserve">: </w:t>
-      </w:r>
-      <w:r>
-        <w:rPr>
-          <w:i/>
-        </w:rPr>
-        <w:t>"Explain your disaster recovery and monitoring strategies."</w:t>
-      </w:r>
-    </w:p>
-    <w:p>
-      <w:pPr>
-        <w:pStyle w:val="ListBullet"/>
-        <w:spacing w:before="0" w:after="60" w:line="276" w:lineRule="auto"/>
-      </w:pPr>
-      <w:r>
-        <w:rPr>
-          <w:b/>
-        </w:rPr>
-        <w:t>A</w:t>
-      </w:r>
-      <w:r>
-        <w:t xml:space="preserve">: </w:t>
-      </w:r>
-      <w:r>
-        <w:rPr>
-          <w:i/>
-        </w:rPr>
-        <w:t>"For disaster recovery, the system has an RPO of 15 minutes and an RTO of 1 hour, supported by compressed backup scripts stored in S3. For monitoring, a Prometheus agent scrapes metrics from our system health endpoint every 15 seconds, Grafana visualizes host and service loads, and ELK parses log patterns."</w:t>
       </w:r>
     </w:p>
     <w:sectPr>

</xml_diff>